<commit_message>
Preserve canonical device names for source verification and improve mobile introduction
</commit_message>
<xml_diff>
--- a/downloads/VELT.docx
+++ b/downloads/VELT.docx
@@ -41,7 +41,7 @@
         <w:rPr>
           <w:sz w:val="20"/>
         </w:rPr>
-        <w:t>Пролог и главы 1–10</w:t>
+        <w:t>Пролог и главы 1–12</w:t>
         <w:br/>
         <w:t>первой части</w:t>
       </w:r>
@@ -226,6 +226,34 @@
       </w:hyperlink>
     </w:p>
     <w:p>
+      <w:pPr>
+        <w:spacing w:after="100"/>
+        <w:ind w:firstLine="0"/>
+      </w:pPr>
+      <w:hyperlink w:anchor="chapter_11">
+        <w:r>
+          <w:rPr>
+            <w:color w:val="000000"/>
+          </w:rPr>
+          <w:t>Глава 11  Лишняя смена</w:t>
+        </w:r>
+      </w:hyperlink>
+    </w:p>
+    <w:p>
+      <w:pPr>
+        <w:spacing w:after="100"/>
+        <w:ind w:firstLine="0"/>
+      </w:pPr>
+      <w:hyperlink w:anchor="chapter_12">
+        <w:r>
+          <w:rPr>
+            <w:color w:val="000000"/>
+          </w:rPr>
+          <w:t>Глава 12  Сухие носки</w:t>
+        </w:r>
+      </w:hyperlink>
+    </w:p>
+    <w:p>
       <w:r>
         <w:br w:type="page"/>
       </w:r>
@@ -263,7 +291,7 @@
         <w:jc w:val="both"/>
       </w:pPr>
       <w:r>
-        <w:t>Лев увеличил лицо. Изображение распалось на мелкие квадраты.</w:t>
+        <w:t>Лев увеличил лицо на экране своего VELT Nova. Изображение распалось на мелкие квадраты.</w:t>
       </w:r>
     </w:p>
     <w:p>
@@ -504,6 +532,14 @@
       </w:pPr>
       <w:r>
         <w:t>В кабинете пахло деревом и остывшим чаем. Стол был новый, слишком большой для одного человека. На дальнем краю стояла старая лампа с зеленоватым плафоном. Лев когда-то заменил в ней провод. Макс с тех пор не позволял её выбрасывать.</w:t>
+      </w:r>
+    </w:p>
+    <w:p>
+      <w:pPr>
+        <w:jc w:val="both"/>
+      </w:pPr>
+      <w:r>
+        <w:t>На экране VELT Station осталось недописанное письмо. Макс свернул его, не сохраняя, и придвинул к Льву свободный стул.</w:t>
       </w:r>
     </w:p>
     <w:p>
@@ -914,6 +950,46 @@
       </w:pPr>
       <w:r>
         <w:t>Лев взял одно печенье. Оно пахло сигаретами, хотя Дэн не курил. Просто хранил пачку вместе с чужой зажигалкой: всё собирался вернуть.</w:t>
+      </w:r>
+    </w:p>
+    <w:p>
+      <w:pPr>
+        <w:jc w:val="both"/>
+      </w:pPr>
+      <w:r>
+        <w:t>Из мастерской вынесли пальму. Один из грузчиков прихватил заодно лейку.</w:t>
+      </w:r>
+    </w:p>
+    <w:p>
+      <w:pPr>
+        <w:jc w:val="both"/>
+      </w:pPr>
+      <w:r>
+        <w:t>— Вот это оставь, — сказал Дэн. — Ей теперь положено выходное пособие.</w:t>
+      </w:r>
+    </w:p>
+    <w:p>
+      <w:pPr>
+        <w:jc w:val="both"/>
+      </w:pPr>
+      <w:r>
+        <w:t>— Кому?</w:t>
+      </w:r>
+    </w:p>
+    <w:p>
+      <w:pPr>
+        <w:jc w:val="both"/>
+      </w:pPr>
+      <w:r>
+        <w:t>— Лейке. Полгода на бесполезной работе.</w:t>
+      </w:r>
+    </w:p>
+    <w:p>
+      <w:pPr>
+        <w:jc w:val="both"/>
+      </w:pPr>
+      <w:r>
+        <w:t>Грузчик посмотрел на пластмассовые листья и впервые за утро улыбнулся.</w:t>
       </w:r>
     </w:p>
     <w:p>
@@ -1814,6 +1890,62 @@
         <w:jc w:val="both"/>
       </w:pPr>
       <w:r>
+        <w:t>— У нас будет журнал инструмента, — сказала она.</w:t>
+      </w:r>
+    </w:p>
+    <w:p>
+      <w:pPr>
+        <w:jc w:val="both"/>
+      </w:pPr>
+      <w:r>
+        <w:t>— С сегодняшнего дня? — спросил Дэн.</w:t>
+      </w:r>
+    </w:p>
+    <w:p>
+      <w:pPr>
+        <w:jc w:val="both"/>
+      </w:pPr>
+      <w:r>
+        <w:t>— Как купим журнал.</w:t>
+      </w:r>
+    </w:p>
+    <w:p>
+      <w:pPr>
+        <w:jc w:val="both"/>
+      </w:pPr>
+      <w:r>
+        <w:t>— Кто запишет, где журнал?</w:t>
+      </w:r>
+    </w:p>
+    <w:p>
+      <w:pPr>
+        <w:jc w:val="both"/>
+      </w:pPr>
+      <w:r>
+        <w:t>Ева подняла глаза. Дэн сразу принялся изучать привод.</w:t>
+      </w:r>
+    </w:p>
+    <w:p>
+      <w:pPr>
+        <w:jc w:val="both"/>
+      </w:pPr>
+      <w:r>
+        <w:t>— Понял. На моей памяти.</w:t>
+      </w:r>
+    </w:p>
+    <w:p>
+      <w:pPr>
+        <w:jc w:val="both"/>
+      </w:pPr>
+      <w:r>
+        <w:t>— Тогда купим два.</w:t>
+      </w:r>
+    </w:p>
+    <w:p>
+      <w:pPr>
+        <w:jc w:val="both"/>
+      </w:pPr>
+      <w:r>
         <w:t>До обеда они делали стенд. Дэн насверлил в фанере лишних отверстий и объявил, что это вентиляция. Лев не стал спорить: держалось крепко. Макс куда-то ездил, вернулся с тяжёлым пакетом, съездил ещё раз, потому что купил не те предохранители. Ева принимала звонки, сидя на перевёрнутой коробке, и каждый раз представлялась так уверенно, будто за перегородкой у неё работали пять отделов.</w:t>
       </w:r>
     </w:p>
@@ -2483,6 +2615,46 @@
         <w:jc w:val="both"/>
       </w:pPr>
       <w:r>
+        <w:t>Ева потребовала записать происшествие в журнал.</w:t>
+      </w:r>
+    </w:p>
+    <w:p>
+      <w:pPr>
+        <w:jc w:val="both"/>
+      </w:pPr>
+      <w:r>
+        <w:t>Дэн написал: «Проверка устойчивости к рабочей среде».</w:t>
+      </w:r>
+    </w:p>
+    <w:p>
+      <w:pPr>
+        <w:jc w:val="both"/>
+      </w:pPr>
+      <w:r>
+        <w:t>Она прочитала через плечо и добавила: «Среда — кофе. Проверял локтем».</w:t>
+      </w:r>
+    </w:p>
+    <w:p>
+      <w:pPr>
+        <w:jc w:val="both"/>
+      </w:pPr>
+      <w:r>
+        <w:t>— Зачем подробности? — спросил Дэн.</w:t>
+      </w:r>
+    </w:p>
+    <w:p>
+      <w:pPr>
+        <w:jc w:val="both"/>
+      </w:pPr>
+      <w:r>
+        <w:t>— Чтобы следующий испытатель не искал кнопку.</w:t>
+      </w:r>
+    </w:p>
+    <w:p>
+      <w:pPr>
+        <w:jc w:val="both"/>
+      </w:pPr>
+      <w:r>
         <w:t>У шестого Лев развёл питание по-другому. Сам сперва не считал решение удачным: слишком много ручной работы, трудно повторить. Но на стенде исчезла помеха, из-за которой график на мониторе по вечерам напоминал пульс испуганного животного.</w:t>
       </w:r>
     </w:p>
@@ -3661,6 +3833,78 @@
         <w:jc w:val="both"/>
       </w:pPr>
       <w:r>
+        <w:t>Ремень безопасности не вытягивался. Дэн попросил отпустить и попробовать ещё раз.</w:t>
+      </w:r>
+    </w:p>
+    <w:p>
+      <w:pPr>
+        <w:jc w:val="both"/>
+      </w:pPr>
+      <w:r>
+        <w:t>— Плавно. Он резких людей не любит.</w:t>
+      </w:r>
+    </w:p>
+    <w:p>
+      <w:pPr>
+        <w:jc w:val="both"/>
+      </w:pPr>
+      <w:r>
+        <w:t>Лев потянул медленнее. Ремень сдался.</w:t>
+      </w:r>
+    </w:p>
+    <w:p>
+      <w:pPr>
+        <w:jc w:val="both"/>
+      </w:pPr>
+      <w:r>
+        <w:t>— А почему здесь собачья шерсть?</w:t>
+      </w:r>
+    </w:p>
+    <w:p>
+      <w:pPr>
+        <w:jc w:val="both"/>
+      </w:pPr>
+      <w:r>
+        <w:t>— Главный пассажир.</w:t>
+      </w:r>
+    </w:p>
+    <w:p>
+      <w:pPr>
+        <w:jc w:val="both"/>
+      </w:pPr>
+      <w:r>
+        <w:t>— Ему сиденье чинят?</w:t>
+      </w:r>
+    </w:p>
+    <w:p>
+      <w:pPr>
+        <w:jc w:val="both"/>
+      </w:pPr>
+      <w:r>
+        <w:t>— Ему можно на заднем лежать.</w:t>
+      </w:r>
+    </w:p>
+    <w:p>
+      <w:pPr>
+        <w:jc w:val="both"/>
+      </w:pPr>
+      <w:r>
+        <w:t>Лев посмотрел назад, на широкий продавленный чехол, потом снова на свои колени.</w:t>
+      </w:r>
+    </w:p>
+    <w:p>
+      <w:pPr>
+        <w:jc w:val="both"/>
+      </w:pPr>
+      <w:r>
+        <w:t>— Передай, что я его уважаю.</w:t>
+      </w:r>
+    </w:p>
+    <w:p>
+      <w:pPr>
+        <w:jc w:val="both"/>
+      </w:pPr>
+      <w:r>
         <w:t>— Удобно? — спросил Дэн.</w:t>
       </w:r>
     </w:p>
@@ -5879,6 +6123,78 @@
         <w:jc w:val="both"/>
       </w:pPr>
       <w:r>
+        <w:t>Анна передала гостю салфетку.</w:t>
+      </w:r>
+    </w:p>
+    <w:p>
+      <w:pPr>
+        <w:jc w:val="both"/>
+      </w:pPr>
+      <w:r>
+        <w:t>— Пит, не чини. Ты же отдыхать пришёл.</w:t>
+      </w:r>
+    </w:p>
+    <w:p>
+      <w:pPr>
+        <w:jc w:val="both"/>
+      </w:pPr>
+      <w:r>
+        <w:t>Макс с облегчением запомнил имя. Через несколько минут понадобилось попросить соль, и он обратился к гостю так уверенно, что Анна обернулась.</w:t>
+      </w:r>
+    </w:p>
+    <w:p>
+      <w:pPr>
+        <w:jc w:val="both"/>
+      </w:pPr>
+      <w:r>
+        <w:t>— Ты только что вспомнил, да?</w:t>
+      </w:r>
+    </w:p>
+    <w:p>
+      <w:pPr>
+        <w:jc w:val="both"/>
+      </w:pPr>
+      <w:r>
+        <w:t>— Нет.</w:t>
+      </w:r>
+    </w:p>
+    <w:p>
+      <w:pPr>
+        <w:jc w:val="both"/>
+      </w:pPr>
+      <w:r>
+        <w:t>Пит подвинул солонку.</w:t>
+      </w:r>
+    </w:p>
+    <w:p>
+      <w:pPr>
+        <w:jc w:val="both"/>
+      </w:pPr>
+      <w:r>
+        <w:t>— Всё нормально. Я однажды на семейном празднике час называл жениного дядю именем собаки.</w:t>
+      </w:r>
+    </w:p>
+    <w:p>
+      <w:pPr>
+        <w:jc w:val="both"/>
+      </w:pPr>
+      <w:r>
+        <w:t>— И что дядя? — спросил Макс.</w:t>
+      </w:r>
+    </w:p>
+    <w:p>
+      <w:pPr>
+        <w:jc w:val="both"/>
+      </w:pPr>
+      <w:r>
+        <w:t>— Отзывался. Жена заметила.</w:t>
+      </w:r>
+    </w:p>
+    <w:p>
+      <w:pPr>
+        <w:jc w:val="both"/>
+      </w:pPr>
+      <w:r>
         <w:t>Вечер всё же получился хорошим. Рыба чуть пересохла, но никто не жаловался. Подруга Анны рассказывала, как у них в библиотеке мужчина три недели возвращал одну книгу, каждый раз забывая её дома. На четвёртый раз принёс сразу две чужие. Макс смеялся и ловил себя на том, что не ждёт телефонного звонка.</w:t>
       </w:r>
     </w:p>
@@ -7569,7 +7885,7 @@
         <w:jc w:val="both"/>
       </w:pPr>
       <w:r>
-        <w:t>— Плохо. Кажется, нашу работу продают под чужим именем. Я не знаю, как доказать.</w:t>
+        <w:t>— Плохо. У другой компании похожая схема. Не понимаю, откуда она у них и что вообще разрешает наш договор.</w:t>
       </w:r>
     </w:p>
     <w:p>
@@ -8358,7 +8674,79 @@
         <w:jc w:val="both"/>
       </w:pPr>
       <w:r>
-        <w:t>В воскресенье Лев принёс хлеб и пакет яблок. Дэн — набор маленьких отвёрток, чем заслужил недоумённый взгляд.</w:t>
+        <w:t>В воскресенье Лев взял хлеб и пакет яблок. Дэн явился к нему с набором маленьких отвёрток, чем заслужил недоумённый взгляд.</w:t>
+      </w:r>
+    </w:p>
+    <w:p>
+      <w:pPr>
+        <w:jc w:val="both"/>
+      </w:pPr>
+      <w:r>
+        <w:t>На лестнице они встретились с Максом, который нёс цветы и пакет с удлинителем.</w:t>
+      </w:r>
+    </w:p>
+    <w:p>
+      <w:pPr>
+        <w:jc w:val="both"/>
+      </w:pPr>
+      <w:r>
+        <w:t>— Зачем? — спросил Лев.</w:t>
+      </w:r>
+    </w:p>
+    <w:p>
+      <w:pPr>
+        <w:jc w:val="both"/>
+      </w:pPr>
+      <w:r>
+        <w:t>— Вдруг розетка далеко.</w:t>
+      </w:r>
+    </w:p>
+    <w:p>
+      <w:pPr>
+        <w:jc w:val="both"/>
+      </w:pPr>
+      <w:r>
+        <w:t>Анна появилась следом, забрала у него пакет и положила возле двери.</w:t>
+      </w:r>
+    </w:p>
+    <w:p>
+      <w:pPr>
+        <w:jc w:val="both"/>
+      </w:pPr>
+      <w:r>
+        <w:t>— Там останется. Мы идём в гости.</w:t>
+      </w:r>
+    </w:p>
+    <w:p>
+      <w:pPr>
+        <w:jc w:val="both"/>
+      </w:pPr>
+      <w:r>
+        <w:t>Дэн спрятал отвёртки за спину. Анна посмотрела на него.</w:t>
+      </w:r>
+    </w:p>
+    <w:p>
+      <w:pPr>
+        <w:jc w:val="both"/>
+      </w:pPr>
+      <w:r>
+        <w:t>— Я видела.</w:t>
+      </w:r>
+    </w:p>
+    <w:p>
+      <w:pPr>
+        <w:jc w:val="both"/>
+      </w:pPr>
+      <w:r>
+        <w:t>— Это подарок.</w:t>
+      </w:r>
+    </w:p>
+    <w:p>
+      <w:pPr>
+        <w:jc w:val="both"/>
+      </w:pPr>
+      <w:r>
+        <w:t>— Удлинитель теперь тоже подарок. Поздравляю Еву с хорошими друзьями.</w:t>
       </w:r>
     </w:p>
     <w:p>
@@ -8390,7 +8778,7 @@
         <w:jc w:val="both"/>
       </w:pPr>
       <w:r>
-        <w:t>Макс пришёл с Анной. Лев видел её раньше мельком, в дверях мастерской, а теперь впервые смог нормально поздороваться. Она была ниже, чем казалась издали, с короткими ногтями и спокойным взглядом человека, которому не нужно ничего продавать.</w:t>
+        <w:t>Уже в квартире Лев смог нормально поздороваться с Анной. Раньше видел её только мельком, в дверях мастерской. Она была ниже, чем казалась издали, с короткими ногтями и спокойным взглядом человека, которому не нужно ничего продавать.</w:t>
       </w:r>
     </w:p>
     <w:p>
@@ -8735,6 +9123,1144 @@
       </w:pPr>
       <w:r>
         <w:t>На этот раз за своей работой он шёл не один.</w:t>
+      </w:r>
+    </w:p>
+    <w:p>
+      <w:bookmarkStart w:id="12" w:name="chapter_11"/>
+      <w:pPr>
+        <w:pStyle w:val="Heading1"/>
+        <w:pageBreakBefore/>
+        <w:spacing w:before="440"/>
+      </w:pPr>
+      <w:r>
+        <w:t>Глава 11</w:t>
+      </w:r>
+      <w:bookmarkEnd w:id="12"/>
+    </w:p>
+    <w:p>
+      <w:pPr>
+        <w:pStyle w:val="Heading2"/>
+      </w:pPr>
+      <w:r>
+        <w:t>Лишняя смена</w:t>
+      </w:r>
+    </w:p>
+    <w:p>
+      <w:pPr>
+        <w:ind w:firstLine="0"/>
+        <w:jc w:val="both"/>
+      </w:pPr>
+      <w:r>
+        <w:t>Дэн хранил важные бумаги под коробкой с ёлочными игрушками. Лев узнал свою схему прежде, чем тот развернул лист до конца: на сгибе осталось пятно от большого пальца. Он поставил его, когда менял в старом принтере картридж.</w:t>
+      </w:r>
+    </w:p>
+    <w:p>
+      <w:pPr>
+        <w:jc w:val="both"/>
+      </w:pPr>
+      <w:r>
+        <w:t>— Вот, — сказал Дэн. — Это тогда и отвозил.</w:t>
+      </w:r>
+    </w:p>
+    <w:p>
+      <w:pPr>
+        <w:jc w:val="both"/>
+      </w:pPr>
+      <w:r>
+        <w:t>Комната была маленькая, на двоих с братом, который работал по ночам. На второй кровати лежала чистая рабочая рубашка. У окна стоял Дэнов датчик в пластиковом контейнере, рядом — таз с водой.</w:t>
+      </w:r>
+    </w:p>
+    <w:p>
+      <w:pPr>
+        <w:jc w:val="both"/>
+      </w:pPr>
+      <w:r>
+        <w:t>Лев взял листы. Не окончательное решение, не шестой образец. Ранний вариант, от которого они отказались. Но ручной путь питания уже был на месте. Он перевернул страницу и нашёл пометку: «Автор согласовал».</w:t>
+      </w:r>
+    </w:p>
+    <w:p>
+      <w:pPr>
+        <w:jc w:val="both"/>
+      </w:pPr>
+      <w:r>
+        <w:t>Ни подписи, ни даты.</w:t>
+      </w:r>
+    </w:p>
+    <w:p>
+      <w:pPr>
+        <w:jc w:val="both"/>
+      </w:pPr>
+      <w:r>
+        <w:t>— Ты это писал?</w:t>
+      </w:r>
+    </w:p>
+    <w:p>
+      <w:pPr>
+        <w:jc w:val="both"/>
+      </w:pPr>
+      <w:r>
+        <w:t>Дэн наклонился.</w:t>
+      </w:r>
+    </w:p>
+    <w:p>
+      <w:pPr>
+        <w:jc w:val="both"/>
+      </w:pPr>
+      <w:r>
+        <w:t>— Не моё. Я там только количество проверял.</w:t>
+      </w:r>
+    </w:p>
+    <w:p>
+      <w:pPr>
+        <w:jc w:val="both"/>
+      </w:pPr>
+      <w:r>
+        <w:t>— А кто автор?</w:t>
+      </w:r>
+    </w:p>
+    <w:p>
+      <w:pPr>
+        <w:jc w:val="both"/>
+      </w:pPr>
+      <w:r>
+        <w:t>— Не знаю. Тут же не сказано, что ты.</w:t>
+      </w:r>
+    </w:p>
+    <w:p>
+      <w:pPr>
+        <w:jc w:val="both"/>
+      </w:pPr>
+      <w:r>
+        <w:t>Лев перечитал короткую фразу. Возразить было нечего. Под неё мог попасть Макс, компания, человек из центра. Чем меньше слов оставляли на бумаге, тем больше людей могли потом решить, что всё поняли правильно.</w:t>
+      </w:r>
+    </w:p>
+    <w:p>
+      <w:pPr>
+        <w:jc w:val="both"/>
+      </w:pPr>
+      <w:r>
+        <w:t>На кухне за стеной зашумел чайник. Дэн вышел и вернулся с двумя чашками.</w:t>
+      </w:r>
+    </w:p>
+    <w:p>
+      <w:pPr>
+        <w:jc w:val="both"/>
+      </w:pPr>
+      <w:r>
+        <w:t>— Мать велела накормить. Ты когда ел?</w:t>
+      </w:r>
+    </w:p>
+    <w:p>
+      <w:pPr>
+        <w:jc w:val="both"/>
+      </w:pPr>
+      <w:r>
+        <w:t>— У Евы.</w:t>
+      </w:r>
+    </w:p>
+    <w:p>
+      <w:pPr>
+        <w:jc w:val="both"/>
+      </w:pPr>
+      <w:r>
+        <w:t>— Я тоже так сказал. Не помогло.</w:t>
+      </w:r>
+    </w:p>
+    <w:p>
+      <w:pPr>
+        <w:jc w:val="both"/>
+      </w:pPr>
+      <w:r>
+        <w:t>Мать Дэна принесла тарелку бутербродов и спросила, не тесно ли им. Потом увидела бумаги и сразу заговорила тише. Леву стало не по себе: взрослые дома начинали беречь их работу, как будто от неё уже зависело нечто большее, чем две маленькие зарплаты.</w:t>
+      </w:r>
+    </w:p>
+    <w:p>
+      <w:pPr>
+        <w:jc w:val="both"/>
+      </w:pPr>
+      <w:r>
+        <w:t>Утром Макс отвёз их к Нине. Её кабинет помещался над стоматологией; в коридоре пахло дезинфицирующим средством, и каждые несколько минут снизу доносился звук, от которого Дэн переставал двигать челюстью.</w:t>
+      </w:r>
+    </w:p>
+    <w:p>
+      <w:pPr>
+        <w:jc w:val="both"/>
+      </w:pPr>
+      <w:r>
+        <w:t>Нина выслушала всё, не прерывая. Потом разложила договор по порядку.</w:t>
+      </w:r>
+    </w:p>
+    <w:p>
+      <w:pPr>
+        <w:jc w:val="both"/>
+      </w:pPr>
+      <w:r>
+        <w:t>— Двенадцатой страницы нет, — сказал Лев.</w:t>
+      </w:r>
+    </w:p>
+    <w:p>
+      <w:pPr>
+        <w:jc w:val="both"/>
+      </w:pPr>
+      <w:r>
+        <w:t>— Запросим. Но начнём с того, что есть.</w:t>
+      </w:r>
+    </w:p>
+    <w:p>
+      <w:pPr>
+        <w:jc w:val="both"/>
+      </w:pPr>
+      <w:r>
+        <w:t>Она показывала абзацы по очереди. Внешний центр действительно получил право использовать часть предварительных материалов для совместных проектов. Макс подписал это вместе с авансом. Хранение оригинала не означало автоматической передачи исключительных прав, но доступ к исходным листам разрешал. Ни одну из этих вещей они толком не обсудили между собой.</w:t>
+      </w:r>
+    </w:p>
+    <w:p>
+      <w:pPr>
+        <w:jc w:val="both"/>
+      </w:pPr>
+      <w:r>
+        <w:t>— Значит, всё законно? — спросил Макс.</w:t>
+      </w:r>
+    </w:p>
+    <w:p>
+      <w:pPr>
+        <w:jc w:val="both"/>
+      </w:pPr>
+      <w:r>
+        <w:t>— Я этого не говорила. Я говорю, что по этим бумагам нельзя объявить кражей любое сходство. И нельзя требовать деньги назад просто потому, что вы впервые внимательно прочитали договор.</w:t>
+      </w:r>
+    </w:p>
+    <w:p>
+      <w:pPr>
+        <w:jc w:val="both"/>
+      </w:pPr>
+      <w:r>
+        <w:t>Дэн посмотрел в пол. Лев сидел неподвижно.</w:t>
+      </w:r>
+    </w:p>
+    <w:p>
+      <w:pPr>
+        <w:jc w:val="both"/>
+      </w:pPr>
+      <w:r>
+        <w:t>— Что можно? — спросила Ева.</w:t>
+      </w:r>
+    </w:p>
+    <w:p>
+      <w:pPr>
+        <w:jc w:val="both"/>
+      </w:pPr>
+      <w:r>
+        <w:t>Она приехала сама, с отдельной папкой. Нина придвинула к себе её экземпляры.</w:t>
+      </w:r>
+    </w:p>
+    <w:p>
+      <w:pPr>
+        <w:jc w:val="both"/>
+      </w:pPr>
+      <w:r>
+        <w:t>— Получить полный договор. Установить, какие именно материалы переданы. Потребовать вернуть физический образец, если оснований удерживать его больше нет. И больше не подписывать приёмку, когда вещь не совпадает с описанием.</w:t>
+      </w:r>
+    </w:p>
+    <w:p>
+      <w:pPr>
+        <w:jc w:val="both"/>
+      </w:pPr>
+      <w:r>
+        <w:t>Лев поднял голову.</w:t>
+      </w:r>
+    </w:p>
+    <w:p>
+      <w:pPr>
+        <w:jc w:val="both"/>
+      </w:pPr>
+      <w:r>
+        <w:t>— Это я подписал.</w:t>
+      </w:r>
+    </w:p>
+    <w:p>
+      <w:pPr>
+        <w:jc w:val="both"/>
+      </w:pPr>
+      <w:r>
+        <w:t>— Я вижу.</w:t>
+      </w:r>
+    </w:p>
+    <w:p>
+      <w:pPr>
+        <w:jc w:val="both"/>
+      </w:pPr>
+      <w:r>
+        <w:t>В её голосе не было ни сочувствия, ни удовольствия от чужой ошибки. Он неожиданно обрадовался этому. Можно было наконец обсуждать сделанное, не выясняя, хороший ли он человек.</w:t>
+      </w:r>
+    </w:p>
+    <w:p>
+      <w:pPr>
+        <w:jc w:val="both"/>
+      </w:pPr>
+      <w:r>
+        <w:t>Ответ на запрос пришёл через несколько недель. Вместе с ним курьер привёз маленькую коробку. В ней лежала плата с двумя насечками, точкой и поперечной линией у нижнего крепления. Настоящая.</w:t>
+      </w:r>
+    </w:p>
+    <w:p>
+      <w:pPr>
+        <w:jc w:val="both"/>
+      </w:pPr>
+      <w:r>
+        <w:t>Лев долго смотрел на неё под лампой. Разъём был слегка погнут, защитное покрытие потемнело, но ручной проводник лежал на прежнем месте. На стенде помеха не появилась.</w:t>
+      </w:r>
+    </w:p>
+    <w:p>
+      <w:pPr>
+        <w:jc w:val="both"/>
+      </w:pPr>
+      <w:r>
+        <w:t>Копия двенадцатой страницы тоже нашлась. На ней были дополнительные условия регистрации и передачи промежуточных результатов. Почти всё то, о чём говорила Нина. Ничего, что позволяло бы одним взглядом понять: вот здесь их обманули намеренно.</w:t>
+      </w:r>
+    </w:p>
+    <w:p>
+      <w:pPr>
+        <w:jc w:val="both"/>
+      </w:pPr>
+      <w:r>
+        <w:t>Макс стоял рядом весь первый прогон.</w:t>
+      </w:r>
+    </w:p>
+    <w:p>
+      <w:pPr>
+        <w:jc w:val="both"/>
+      </w:pPr>
+      <w:r>
+        <w:t>— Возврат оформим правильно, — сказал он.</w:t>
+      </w:r>
+    </w:p>
+    <w:p>
+      <w:pPr>
+        <w:jc w:val="both"/>
+      </w:pPr>
+      <w:r>
+        <w:t>Ева уже держала ручку.</w:t>
+      </w:r>
+    </w:p>
+    <w:p>
+      <w:pPr>
+        <w:jc w:val="both"/>
+      </w:pPr>
+      <w:r>
+        <w:t>— По одному листу каждому.</w:t>
+      </w:r>
+    </w:p>
+    <w:p>
+      <w:pPr>
+        <w:jc w:val="both"/>
+      </w:pPr>
+      <w:r>
+        <w:t>— Два мне, — попросил Дэн. — Один под ёлку.</w:t>
+      </w:r>
+    </w:p>
+    <w:p>
+      <w:pPr>
+        <w:jc w:val="both"/>
+      </w:pPr>
+      <w:r>
+        <w:t>Она не улыбнулась, но лишний экземпляр сделала.</w:t>
+      </w:r>
+    </w:p>
+    <w:p>
+      <w:pPr>
+        <w:jc w:val="both"/>
+      </w:pPr>
+      <w:r>
+        <w:t>Макс решил, что худшая часть спора закончилась. Они потеряли права, время и деньги, однако получили вещь обратно и понятное объяснение. Лев понимал, почему ему хочется на этом остановиться. Сам тоже хотел. Надоело носить домой бумаги, от которых невозможно приготовить ужин или заплатить за квартиру.</w:t>
+      </w:r>
+    </w:p>
+    <w:p>
+      <w:pPr>
+        <w:jc w:val="both"/>
+      </w:pPr>
+      <w:r>
+        <w:t>Только пометка «Автор согласовал» не получила автора.</w:t>
+      </w:r>
+    </w:p>
+    <w:p>
+      <w:pPr>
+        <w:jc w:val="both"/>
+      </w:pPr>
+      <w:r>
+        <w:t>Он сохранил лист отдельно.</w:t>
+      </w:r>
+    </w:p>
+    <w:p>
+      <w:pPr>
+        <w:jc w:val="both"/>
+      </w:pPr>
+      <w:r>
+        <w:t>Работы стало больше, доходов — почти нет. В мастерской появились вечерние смены, которые сперва называли временными, потом перестали как-либо называть. Макс не требовал оставаться. Просто в шесть ещё были клиенты, к семи приезжали детали, после восьми становилось тихо и наконец можно было нормально подумать. Лев уходил последним и сам убеждал себя, что это его выбор.</w:t>
+      </w:r>
+    </w:p>
+    <w:p>
+      <w:pPr>
+        <w:jc w:val="both"/>
+      </w:pPr>
+      <w:r>
+        <w:t>Однажды он перепутал пакеты у входа.</w:t>
+      </w:r>
+    </w:p>
+    <w:p>
+      <w:pPr>
+        <w:jc w:val="both"/>
+      </w:pPr>
+      <w:r>
+        <w:t>Его мать заказала продукты с доставкой. Курьер позвонил, когда Лев как раз шёл домой, и попросил забрать из машины: подъезд не открывался. Рядом стояла девушка в светлой куртке, тоже ждала заказ. Они обменялись короткими кивками, каждый взял свой пакет, разошлись.</w:t>
+      </w:r>
+    </w:p>
+    <w:p>
+      <w:pPr>
+        <w:jc w:val="both"/>
+      </w:pPr>
+      <w:r>
+        <w:t>Дома Лев обнаружил мягкую детскую игрушку, пачку кофе без кофеина и четыре маленькие банки кошачьего корма.</w:t>
+      </w:r>
+    </w:p>
+    <w:p>
+      <w:pPr>
+        <w:jc w:val="both"/>
+      </w:pPr>
+      <w:r>
+        <w:t>Мать смотрела на них с интересом.</w:t>
+      </w:r>
+    </w:p>
+    <w:p>
+      <w:pPr>
+        <w:jc w:val="both"/>
+      </w:pPr>
+      <w:r>
+        <w:t>— Если это тебе премию выдали, сначала прочитай состав.</w:t>
+      </w:r>
+    </w:p>
+    <w:p>
+      <w:pPr>
+        <w:jc w:val="both"/>
+      </w:pPr>
+      <w:r>
+        <w:t>Он позвонил в доставку. Через десять минут в дверь постучали.</w:t>
+      </w:r>
+    </w:p>
+    <w:p>
+      <w:pPr>
+        <w:jc w:val="both"/>
+      </w:pPr>
+      <w:r>
+        <w:t>Девушка со двора держала его пакет двумя руками.</w:t>
+      </w:r>
+    </w:p>
+    <w:p>
+      <w:pPr>
+        <w:jc w:val="both"/>
+      </w:pPr>
+      <w:r>
+        <w:t>— Кажется, ваше. Я ещё подумала, зачем мне столько картошки.</w:t>
+      </w:r>
+    </w:p>
+    <w:p>
+      <w:pPr>
+        <w:jc w:val="both"/>
+      </w:pPr>
+      <w:r>
+        <w:t>— А я хотел спросить, где кошка.</w:t>
+      </w:r>
+    </w:p>
+    <w:p>
+      <w:pPr>
+        <w:jc w:val="both"/>
+      </w:pPr>
+      <w:r>
+        <w:t>— У сестры. Я ей помогала. Свою мне пока рано.</w:t>
+      </w:r>
+    </w:p>
+    <w:p>
+      <w:pPr>
+        <w:jc w:val="both"/>
+      </w:pPr>
+      <w:r>
+        <w:t>Лев переставил банки обратно, подал пакет. Девушка не ушла.</w:t>
+      </w:r>
+    </w:p>
+    <w:p>
+      <w:pPr>
+        <w:jc w:val="both"/>
+      </w:pPr>
+      <w:r>
+        <w:t>— Там внизу упаковка из аптеки. Она промокла, но внутри сухо. Я переложила наверх.</w:t>
+      </w:r>
+    </w:p>
+    <w:p>
+      <w:pPr>
+        <w:jc w:val="both"/>
+      </w:pPr>
+      <w:r>
+        <w:t>— Спасибо.</w:t>
+      </w:r>
+    </w:p>
+    <w:p>
+      <w:pPr>
+        <w:jc w:val="both"/>
+      </w:pPr>
+      <w:r>
+        <w:t>Мать вышла в коридор и пригласила её на чай. Лев приготовился объяснять, что нельзя звать домой каждого человека, который случайно принёс их картошку. Но девушка посмотрела на часы и согласилась.</w:t>
+      </w:r>
+    </w:p>
+    <w:p>
+      <w:pPr>
+        <w:jc w:val="both"/>
+      </w:pPr>
+      <w:r>
+        <w:t>Звали её Вера. Она работала в больнице и ждала сестру, которая задерживалась. За столом не рассказывала о работе, не старалась понравиться. Спросила, почему у них на кухне светильник висит немного криво.</w:t>
+      </w:r>
+    </w:p>
+    <w:p>
+      <w:pPr>
+        <w:jc w:val="both"/>
+      </w:pPr>
+      <w:r>
+        <w:t>Лев начал объяснять про крепление. Мать перебила:</w:t>
+      </w:r>
+    </w:p>
+    <w:p>
+      <w:pPr>
+        <w:jc w:val="both"/>
+      </w:pPr>
+      <w:r>
+        <w:t>— Потому что он чужое чинит. На своё времени нет.</w:t>
+      </w:r>
+    </w:p>
+    <w:p>
+      <w:pPr>
+        <w:jc w:val="both"/>
+      </w:pPr>
+      <w:r>
+        <w:t>Вера посмотрела на него без жалости, и это снова оказалось приятно.</w:t>
+      </w:r>
+    </w:p>
+    <w:p>
+      <w:pPr>
+        <w:jc w:val="both"/>
+      </w:pPr>
+      <w:r>
+        <w:t>Когда он провожал её, лестничная лампа мигнула. Лев машинально поднял голову.</w:t>
+      </w:r>
+    </w:p>
+    <w:p>
+      <w:pPr>
+        <w:jc w:val="both"/>
+      </w:pPr>
+      <w:r>
+        <w:t>— Эту тоже потом? — спросила она.</w:t>
+      </w:r>
+    </w:p>
+    <w:p>
+      <w:pPr>
+        <w:jc w:val="both"/>
+      </w:pPr>
+      <w:r>
+        <w:t>— Эта общая. Здесь можно сказать, что не моя.</w:t>
+      </w:r>
+    </w:p>
+    <w:p>
+      <w:pPr>
+        <w:jc w:val="both"/>
+      </w:pPr>
+      <w:r>
+        <w:t>— Удобная работа.</w:t>
+      </w:r>
+    </w:p>
+    <w:p>
+      <w:pPr>
+        <w:jc w:val="both"/>
+      </w:pPr>
+      <w:r>
+        <w:t>Она спустилась на две ступеньки, обернулась.</w:t>
+      </w:r>
+    </w:p>
+    <w:p>
+      <w:pPr>
+        <w:jc w:val="both"/>
+      </w:pPr>
+      <w:r>
+        <w:t>— Спасибо за чай. И кошку не заводите из чувства вины. Я корм забрала.</w:t>
+      </w:r>
+    </w:p>
+    <w:p>
+      <w:pPr>
+        <w:jc w:val="both"/>
+      </w:pPr>
+      <w:r>
+        <w:t>На следующий день Лев ушёл из мастерской в шесть. Дэн посмотрел на часы, потом на него.</w:t>
+      </w:r>
+    </w:p>
+    <w:p>
+      <w:pPr>
+        <w:jc w:val="both"/>
+      </w:pPr>
+      <w:r>
+        <w:t>— Куда?</w:t>
+      </w:r>
+    </w:p>
+    <w:p>
+      <w:pPr>
+        <w:jc w:val="both"/>
+      </w:pPr>
+      <w:r>
+        <w:t>— Домой.</w:t>
+      </w:r>
+    </w:p>
+    <w:p>
+      <w:pPr>
+        <w:jc w:val="both"/>
+      </w:pPr>
+      <w:r>
+        <w:t>— Что-нибудь случилось?</w:t>
+      </w:r>
+    </w:p>
+    <w:p>
+      <w:pPr>
+        <w:jc w:val="both"/>
+      </w:pPr>
+      <w:r>
+        <w:t>Лев хотел ответить привычным «нет». Подумал о кривой кухонной лампе, о матери, которая всегда оставляла ужин, и о Вере, узнавшей про его работу за пять минут.</w:t>
+      </w:r>
+    </w:p>
+    <w:p>
+      <w:pPr>
+        <w:jc w:val="both"/>
+      </w:pPr>
+      <w:r>
+        <w:t>— Пока ничего, — сказал он. — Хочу успеть.</w:t>
+      </w:r>
+    </w:p>
+    <w:p>
+      <w:bookmarkStart w:id="13" w:name="chapter_12"/>
+      <w:pPr>
+        <w:pStyle w:val="Heading1"/>
+        <w:pageBreakBefore/>
+        <w:spacing w:before="440"/>
+      </w:pPr>
+      <w:r>
+        <w:t>Глава 12</w:t>
+      </w:r>
+      <w:bookmarkEnd w:id="13"/>
+    </w:p>
+    <w:p>
+      <w:pPr>
+        <w:pStyle w:val="Heading2"/>
+      </w:pPr>
+      <w:r>
+        <w:t>Сухие носки</w:t>
+      </w:r>
+    </w:p>
+    <w:p>
+      <w:pPr>
+        <w:ind w:firstLine="0"/>
+        <w:jc w:val="both"/>
+      </w:pPr>
+      <w:r>
+        <w:t>Когда у Макса родилась дочь, мастерская три дня не могла вернуть себе обычный порядок.</w:t>
+      </w:r>
+    </w:p>
+    <w:p>
+      <w:pPr>
+        <w:jc w:val="both"/>
+      </w:pPr>
+      <w:r>
+        <w:t>В первый день он всем позвонил. Во второй забыл, кому уже звонил. В третий привёз фотографию ребёнка, на которой были видны одеяло, край кровати и почти ничего больше.</w:t>
+      </w:r>
+    </w:p>
+    <w:p>
+      <w:pPr>
+        <w:jc w:val="both"/>
+      </w:pPr>
+      <w:r>
+        <w:t>— Очень похожа, — сказал Дэн.</w:t>
+      </w:r>
+    </w:p>
+    <w:p>
+      <w:pPr>
+        <w:jc w:val="both"/>
+      </w:pPr>
+      <w:r>
+        <w:t>— На кого?</w:t>
+      </w:r>
+    </w:p>
+    <w:p>
+      <w:pPr>
+        <w:jc w:val="both"/>
+      </w:pPr>
+      <w:r>
+        <w:t>— На человека, который не давал тебе спать.</w:t>
+      </w:r>
+    </w:p>
+    <w:p>
+      <w:pPr>
+        <w:jc w:val="both"/>
+      </w:pPr>
+      <w:r>
+        <w:t>Ева забрала фотографию и приколола над столом. Макс смотрел, как она выбирает место, и не мог перестать улыбаться.</w:t>
+      </w:r>
+    </w:p>
+    <w:p>
+      <w:pPr>
+        <w:jc w:val="both"/>
+      </w:pPr>
+      <w:r>
+        <w:t>Дочку назвали Милой. Сначала он произносил имя осторожно, словно проверял, подходит ли. Потом начал вставлять почти в каждый разговор. Мила спит, Мила проснулась, Анна с Милой вернулись. По голосу Лев понимал: Макс наконец получил вещь, которую не надо было доказывать чужому заказчику.</w:t>
+      </w:r>
+    </w:p>
+    <w:p>
+      <w:pPr>
+        <w:jc w:val="both"/>
+      </w:pPr>
+      <w:r>
+        <w:t>Сам ребёнок вещью, конечно, не был и быстро сообщил об этом всей квартире.</w:t>
+      </w:r>
+    </w:p>
+    <w:p>
+      <w:pPr>
+        <w:jc w:val="both"/>
+      </w:pPr>
+      <w:r>
+        <w:t>Ева отвезла молодой семье еду, Дэн принёс маленький ночник. Сделал сам, но ничего не подписал: на этот раз хотел подарить, а не оставить историю разработки. Лев пришёл с пакетом подгузников и понял у двери, что не знает размера.</w:t>
+      </w:r>
+    </w:p>
+    <w:p>
+      <w:pPr>
+        <w:jc w:val="both"/>
+      </w:pPr>
+      <w:r>
+        <w:t>— Этот подойдёт? — спросил он у Анны.</w:t>
+      </w:r>
+    </w:p>
+    <w:p>
+      <w:pPr>
+        <w:jc w:val="both"/>
+      </w:pPr>
+      <w:r>
+        <w:t>— Пока да. Через месяц — посмотрим.</w:t>
+      </w:r>
+    </w:p>
+    <w:p>
+      <w:pPr>
+        <w:jc w:val="both"/>
+      </w:pPr>
+      <w:r>
+        <w:t>В её голосе не было праздника. Она стояла в домашней кофте с пятном у плеча, и Лев вдруг заметил, что все три дня они поздравляли в основном Макса.</w:t>
+      </w:r>
+    </w:p>
+    <w:p>
+      <w:pPr>
+        <w:jc w:val="both"/>
+      </w:pPr>
+      <w:r>
+        <w:t>— Что вам принести ещё?</w:t>
+      </w:r>
+    </w:p>
+    <w:p>
+      <w:pPr>
+        <w:jc w:val="both"/>
+      </w:pPr>
+      <w:r>
+        <w:t>Анна подумала.</w:t>
+      </w:r>
+    </w:p>
+    <w:p>
+      <w:pPr>
+        <w:jc w:val="both"/>
+      </w:pPr>
+      <w:r>
+        <w:t>— Заберите его на два часа. Или ребёнка подержите, а я помою голову.</w:t>
+      </w:r>
+    </w:p>
+    <w:p>
+      <w:pPr>
+        <w:jc w:val="both"/>
+      </w:pPr>
+      <w:r>
+        <w:t>Макс тут же начал объяснять, что он и сам может. Анна посмотрела на него.</w:t>
+      </w:r>
+    </w:p>
+    <w:p>
+      <w:pPr>
+        <w:jc w:val="both"/>
+      </w:pPr>
+      <w:r>
+        <w:t>— Ты можешь. Только не предлагай мне вместо этого подождать ещё десять минут.</w:t>
+      </w:r>
+    </w:p>
+    <w:p>
+      <w:pPr>
+        <w:jc w:val="both"/>
+      </w:pPr>
+      <w:r>
+        <w:t>Лев подержал Милу. Она была неожиданно тяжёлая для такого маленького человека. Устроилась у него на сгибе руки, сморщила лицо, потом успокоилась. Лев боялся двигаться.</w:t>
+      </w:r>
+    </w:p>
+    <w:p>
+      <w:pPr>
+        <w:jc w:val="both"/>
+      </w:pPr>
+      <w:r>
+        <w:t>Макс сел напротив и шепнул:</w:t>
+      </w:r>
+    </w:p>
+    <w:p>
+      <w:pPr>
+        <w:jc w:val="both"/>
+      </w:pPr>
+      <w:r>
+        <w:t>— Хорошо держишь.</w:t>
+      </w:r>
+    </w:p>
+    <w:p>
+      <w:pPr>
+        <w:jc w:val="both"/>
+      </w:pPr>
+      <w:r>
+        <w:t>— Я просто не дышу.</w:t>
+      </w:r>
+    </w:p>
+    <w:p>
+      <w:pPr>
+        <w:jc w:val="both"/>
+      </w:pPr>
+      <w:r>
+        <w:t>— Я первые два дня тоже.</w:t>
+      </w:r>
+    </w:p>
+    <w:p>
+      <w:pPr>
+        <w:jc w:val="both"/>
+      </w:pPr>
+      <w:r>
+        <w:t>Анна смеялась уже из ванной. Вода заглушала её голос, но они оба услышали.</w:t>
+      </w:r>
+    </w:p>
+    <w:p>
+      <w:pPr>
+        <w:jc w:val="both"/>
+      </w:pPr>
+      <w:r>
+        <w:t>За следующую зиму Мила научилась сидеть, а компания — просить отсрочки. Макс однажды пришёл на переговоры с детской наклейкой на рукаве. Никто не сказал. Он заметил только вечером, когда Ева сняла наклейку и приклеила к монитору.</w:t>
+      </w:r>
+    </w:p>
+    <w:p>
+      <w:pPr>
+        <w:jc w:val="both"/>
+      </w:pPr>
+      <w:r>
+        <w:t>— Помогла? — спросила она.</w:t>
+      </w:r>
+    </w:p>
+    <w:p>
+      <w:pPr>
+        <w:jc w:val="both"/>
+      </w:pPr>
+      <w:r>
+        <w:t>— Не знаю. Денег не дали.</w:t>
+      </w:r>
+    </w:p>
+    <w:p>
+      <w:pPr>
+        <w:jc w:val="both"/>
+      </w:pPr>
+      <w:r>
+        <w:t>— Значит, переговорщик слабый. Наклейка хорошая.</w:t>
+      </w:r>
+    </w:p>
+    <w:p>
+      <w:pPr>
+        <w:jc w:val="both"/>
+      </w:pPr>
+      <w:r>
+        <w:t>Иногда казалось, жизнь движется вперёд у всех, кроме VELT. Люди меняли квартиры, заболевали, мирились, заводили детей. В мастерской всё ещё берегли коробки и считали, сколько заказов нужно до аренды.</w:t>
+      </w:r>
+    </w:p>
+    <w:p>
+      <w:pPr>
+        <w:jc w:val="both"/>
+      </w:pPr>
+      <w:r>
+        <w:t>Лев встречался с Верой раз в неделю. Иногда получалось дважды, иногда он отменял. Она не устраивала сцен. Только переставала предлагать дни, если он отменял слишком часто.</w:t>
+      </w:r>
+    </w:p>
+    <w:p>
+      <w:pPr>
+        <w:jc w:val="both"/>
+      </w:pPr>
+      <w:r>
+        <w:t>Однажды он приехал к ней после полуночи. Привёз пирог из пекарни, холодный, немного примятый. Вера открыла дверь не сразу.</w:t>
+      </w:r>
+    </w:p>
+    <w:p>
+      <w:pPr>
+        <w:jc w:val="both"/>
+      </w:pPr>
+      <w:r>
+        <w:t>— Я спала.</w:t>
+      </w:r>
+    </w:p>
+    <w:p>
+      <w:pPr>
+        <w:jc w:val="both"/>
+      </w:pPr>
+      <w:r>
+        <w:t>— Прости. Мы закончили позже.</w:t>
+      </w:r>
+    </w:p>
+    <w:p>
+      <w:pPr>
+        <w:jc w:val="both"/>
+      </w:pPr>
+      <w:r>
+        <w:t>— Я знаю. Ты написал.</w:t>
+      </w:r>
+    </w:p>
+    <w:p>
+      <w:pPr>
+        <w:jc w:val="both"/>
+      </w:pPr>
+      <w:r>
+        <w:t>Он поднял пакет.</w:t>
+      </w:r>
+    </w:p>
+    <w:p>
+      <w:pPr>
+        <w:jc w:val="both"/>
+      </w:pPr>
+      <w:r>
+        <w:t>— Это тебе.</w:t>
+      </w:r>
+    </w:p>
+    <w:p>
+      <w:pPr>
+        <w:jc w:val="both"/>
+      </w:pPr>
+      <w:r>
+        <w:t>Она посторонилась. На кухне горел один светильник. Вера поставила чайник, но сама чай пить не стала. Сидела, закутавшись в одеяло, и смотрела, как Лев ест принесённый им же пирог.</w:t>
+      </w:r>
+    </w:p>
+    <w:p>
+      <w:pPr>
+        <w:jc w:val="both"/>
+      </w:pPr>
+      <w:r>
+        <w:t>— Тебе там хорошо? — спросила она.</w:t>
+      </w:r>
+    </w:p>
+    <w:p>
+      <w:pPr>
+        <w:jc w:val="both"/>
+      </w:pPr>
+      <w:r>
+        <w:t>Он кивнул.</w:t>
+      </w:r>
+    </w:p>
+    <w:p>
+      <w:pPr>
+        <w:jc w:val="both"/>
+      </w:pPr>
+      <w:r>
+        <w:t>— Тогда почему ты приезжаешь таким?</w:t>
+      </w:r>
+    </w:p>
+    <w:p>
+      <w:pPr>
+        <w:jc w:val="both"/>
+      </w:pPr>
+      <w:r>
+        <w:t>Лев хотел сказать, что устал. Это был ответ почти на любой неудобный вопрос. Но Вера ждала другого.</w:t>
+      </w:r>
+    </w:p>
+    <w:p>
+      <w:pPr>
+        <w:jc w:val="both"/>
+      </w:pPr>
+      <w:r>
+        <w:t>— Иногда мне кажется, если я уйду, они не закончат.</w:t>
+      </w:r>
+    </w:p>
+    <w:p>
+      <w:pPr>
+        <w:jc w:val="both"/>
+      </w:pPr>
+      <w:r>
+        <w:t>— А если не закончат?</w:t>
+      </w:r>
+    </w:p>
+    <w:p>
+      <w:pPr>
+        <w:jc w:val="both"/>
+      </w:pPr>
+      <w:r>
+        <w:t>— Сорвём заказ.</w:t>
+      </w:r>
+    </w:p>
+    <w:p>
+      <w:pPr>
+        <w:jc w:val="both"/>
+      </w:pPr>
+      <w:r>
+        <w:t>— Лев, я не спрашиваю, чем занимается компания. Что случится с тобой, если заказ сорвётся?</w:t>
+      </w:r>
+    </w:p>
+    <w:p>
+      <w:pPr>
+        <w:jc w:val="both"/>
+      </w:pPr>
+      <w:r>
+        <w:t>Он смотрел на чашку. По стенке медленно сползала капля.</w:t>
+      </w:r>
+    </w:p>
+    <w:p>
+      <w:pPr>
+        <w:jc w:val="both"/>
+      </w:pPr>
+      <w:r>
+        <w:t>— Не знаю.</w:t>
+      </w:r>
+    </w:p>
+    <w:p>
+      <w:pPr>
+        <w:jc w:val="both"/>
+      </w:pPr>
+      <w:r>
+        <w:t>Вера кивнула.</w:t>
+      </w:r>
+    </w:p>
+    <w:p>
+      <w:pPr>
+        <w:jc w:val="both"/>
+      </w:pPr>
+      <w:r>
+        <w:t>— Вот это хотя бы похоже на ответ.</w:t>
+      </w:r>
+    </w:p>
+    <w:p>
+      <w:pPr>
+        <w:jc w:val="both"/>
+      </w:pPr>
+      <w:r>
+        <w:t>В тот вечер он не стал оставаться. Попрощался у двери, пошёл пешком до ночного автобуса. Ноги промокли. В мастерской у батареи лежали запасные носки, принесённые Евой, а дома тоже были сухие. Он почему-то подумал об этом как о выборе между двумя местами, где о нём заботились. И впервые допустил, что выбрать иногда нужно дом.</w:t>
+      </w:r>
+    </w:p>
+    <w:p>
+      <w:pPr>
+        <w:jc w:val="both"/>
+      </w:pPr>
+      <w:r>
+        <w:t>Весной они взяли маленький заказ на восстановление оборудования для городской прачечной. Никаких собственных технологий, никаких лицензий. Просто работа, которую можно закончить и получить за неё деньги.</w:t>
+      </w:r>
+    </w:p>
+    <w:p>
+      <w:pPr>
+        <w:jc w:val="both"/>
+      </w:pPr>
+      <w:r>
+        <w:t>Макс почти не участвовал. Лев с Дэном сделали всё сами, Ева согласовала установку. На проверке ничего не перегрелось и не замолчало. Через неделю заказчик перевёл остаток.</w:t>
+      </w:r>
+    </w:p>
+    <w:p>
+      <w:pPr>
+        <w:jc w:val="both"/>
+      </w:pPr>
+      <w:r>
+        <w:t>Ева распечатала подтверждение и приклеила возле календаря.</w:t>
+      </w:r>
+    </w:p>
+    <w:p>
+      <w:pPr>
+        <w:jc w:val="both"/>
+      </w:pPr>
+      <w:r>
+        <w:t>— Не трогать, — сказала она. — Хочу привыкнуть.</w:t>
+      </w:r>
+    </w:p>
+    <w:p>
+      <w:pPr>
+        <w:jc w:val="both"/>
+      </w:pPr>
+      <w:r>
+        <w:t>На полученные деньги заменили старый стол и купили нормальные стулья. Лев выбирал свой дольше всех. Сел, встал, покрутил сиденье, снова сел. Дэн предложил переночевать в магазине, чтобы проверить утреннюю посадку.</w:t>
+      </w:r>
+    </w:p>
+    <w:p>
+      <w:pPr>
+        <w:jc w:val="both"/>
+      </w:pPr>
+      <w:r>
+        <w:t>Вечером Макс пришёл с Милой. Анна должна была забрать её по дороге, поэтому он нёс дочь сам, в тёплой куртке и слишком больших носках. Мила показывала на свет и говорила что-то короткое. Макс отвечал ей с такой серьёзностью, будто принимал техническое задание.</w:t>
+      </w:r>
+    </w:p>
+    <w:p>
+      <w:pPr>
+        <w:jc w:val="both"/>
+      </w:pPr>
+      <w:r>
+        <w:t>Ева закрыла шкаф с мелкими деталями. Дэн отодвинул горячую станцию подальше. Лев поднял с пола кусочек провода, который даже не замечал минуту назад.</w:t>
+      </w:r>
+    </w:p>
+    <w:p>
+      <w:pPr>
+        <w:jc w:val="both"/>
+      </w:pPr>
+      <w:r>
+        <w:t>Мила прошла вдоль столов, держась за Максов палец. Возле новой мебели остановилась, хлопнула ладонью по сиденью и засмеялась.</w:t>
+      </w:r>
+    </w:p>
+    <w:p>
+      <w:pPr>
+        <w:jc w:val="both"/>
+      </w:pPr>
+      <w:r>
+        <w:t>— Одобрено, — сказал Дэн.</w:t>
+      </w:r>
+    </w:p>
+    <w:p>
+      <w:pPr>
+        <w:jc w:val="both"/>
+      </w:pPr>
+      <w:r>
+        <w:t>Макс поднял её на руки. Потом посмотрел на часы и торопливо полез за телефоном.</w:t>
+      </w:r>
+    </w:p>
+    <w:p>
+      <w:pPr>
+        <w:jc w:val="both"/>
+      </w:pPr>
+      <w:r>
+        <w:t>— Анна уже идёт. Мы должны были вниз выйти.</w:t>
+      </w:r>
+    </w:p>
+    <w:p>
+      <w:pPr>
+        <w:jc w:val="both"/>
+      </w:pPr>
+      <w:r>
+        <w:t>Он собрал детские вещи, проверил носки, дважды вернулся за сумкой. Лев смотрел, как торопится человек, который прежде мог забыть обо всём из-за одного удачного графика.</w:t>
+      </w:r>
+    </w:p>
+    <w:p>
+      <w:pPr>
+        <w:jc w:val="both"/>
+      </w:pPr>
+      <w:r>
+        <w:t>После их ухода в помещении осталось пахнуть детским кремом. Стул Льва стоял немного криво: Мила успела оттолкнуть его ногой.</w:t>
+      </w:r>
+    </w:p>
+    <w:p>
+      <w:pPr>
+        <w:jc w:val="both"/>
+      </w:pPr>
+      <w:r>
+        <w:t>Он не сразу поправил.</w:t>
       </w:r>
     </w:p>
     <w:sectPr>

</xml_diff>

<commit_message>
Keep VELT family scenes together in the revised manuscript
</commit_message>
<xml_diff>
--- a/downloads/VELT.docx
+++ b/downloads/VELT.docx
@@ -9361,6 +9361,22 @@
         <w:jc w:val="both"/>
       </w:pPr>
       <w:r>
+        <w:t>Когда шкаф встал на место, Вера открыла обе дверцы и проверила, не качается ли. Лев держал его за стенку, пока она смеялась: теперь можно отпустить.</w:t>
+      </w:r>
+    </w:p>
+    <w:p>
+      <w:pPr>
+        <w:jc w:val="both"/>
+      </w:pPr>
+      <w:r>
+        <w:t>Он отпустил. Шкаф устоял. На один вечер этого оказалось достаточно.</w:t>
+      </w:r>
+    </w:p>
+    <w:p>
+      <w:pPr>
+        <w:jc w:val="both"/>
+      </w:pPr>
+      <w:r>
         <w:t>Через несколько дней Лев задержался в мастерской и застал Романа одного. Тот сидел с телефоном возле уха и смотрел на фотографию сына. Говорил совсем другим голосом, терпеливым и немного смешным, будто боялся слишком громким словом испортить разговор.</w:t>
       </w:r>
     </w:p>
@@ -9562,22 +9578,6 @@
       </w:pPr>
       <w:r>
         <w:t>Утром возле его ящика лежал шарф с цветами команды. Ева купила по дороге и попросила передать мальчику без всякого повода. Роман долго держал пакет, потом тихо поблагодарил и убрал в сумку.</w:t>
-      </w:r>
-    </w:p>
-    <w:p>
-      <w:pPr>
-        <w:jc w:val="both"/>
-      </w:pPr>
-      <w:r>
-        <w:t>Когда шкаф встал на место, Вера открыла обе дверцы и проверила, не качается ли. Лев держал его за стенку, пока она смеялась: теперь можно отпустить.</w:t>
-      </w:r>
-    </w:p>
-    <w:p>
-      <w:pPr>
-        <w:jc w:val="both"/>
-      </w:pPr>
-      <w:r>
-        <w:t>Он отпустил. Шкаф устоял. На один вечер этого оказалось достаточно.</w:t>
       </w:r>
     </w:p>
     <w:p>

</xml_diff>